<commit_message>
[Composer CMS v2.0.beta9 :: Wed, 16 Dec 2015 21:07:10 -0800]
</commit_message>
<xml_diff>
--- a/README.docx
+++ b/README.docx
@@ -71,13 +71,13 @@
         <w:pStyle w:val="Date"/>
       </w:pPr>
       <w:r>
-        <w:t xml:space="preserve">v2.0.beta8</w:t>
-      </w:r>
-      <w:r>
-        <w:t xml:space="preserve"> </w:t>
-      </w:r>
-      <w:r>
-        <w:t xml:space="preserve">(2015-12-04)</w:t>
+        <w:t xml:space="preserve">v2.0.beta9</w:t>
+      </w:r>
+      <w:r>
+        <w:t xml:space="preserve"> </w:t>
+      </w:r>
+      <w:r>
+        <w:t xml:space="preserve">(2015-12-16)</w:t>
       </w:r>
     </w:p>
     <w:p>
@@ -2599,7 +2599,7 @@
     </w:lvl>
   </w:abstractNum>
   <w:abstractNum w:abstractNumId="990">
-    <w:nsid w:val="a63ee53e"/>
+    <w:nsid w:val="9e189e09"/>
     <w:multiLevelType w:val="multilevel"/>
     <w:lvl w:ilvl="0">
       <w:numFmt w:val="bullet"/>
@@ -2680,7 +2680,7 @@
     </w:lvl>
   </w:abstractNum>
   <w:abstractNum w:abstractNumId="991">
-    <w:nsid w:val="c505a942"/>
+    <w:nsid w:val="b4285c4e"/>
     <w:multiLevelType w:val="multilevel"/>
     <w:lvl w:ilvl="0">
       <w:numFmt w:val="bullet"/>

</xml_diff>